<commit_message>
Updated world tiles and monster names
</commit_message>
<xml_diff>
--- a/resources/World-Tiles_Namen.docx
+++ b/resources/World-Tiles_Namen.docx
@@ -2323,6 +2323,13 @@
                 <w:szCs w:val="48"/>
               </w:rPr>
             </w:pPr>
+            <w:r>
+              <w:rPr>
+                <w:sz w:val="48"/>
+                <w:szCs w:val="48"/>
+              </w:rPr>
+              <w:t>Eichenlaub</w:t>
+            </w:r>
           </w:p>
         </w:tc>
         <w:tc>
@@ -2492,6 +2499,13 @@
                 <w:szCs w:val="48"/>
               </w:rPr>
             </w:pPr>
+            <w:r>
+              <w:rPr>
+                <w:sz w:val="48"/>
+                <w:szCs w:val="48"/>
+              </w:rPr>
+              <w:t>Festung</w:t>
+            </w:r>
           </w:p>
         </w:tc>
       </w:tr>
@@ -2968,6 +2982,13 @@
                 <w:szCs w:val="48"/>
               </w:rPr>
             </w:pPr>
+            <w:r>
+              <w:rPr>
+                <w:sz w:val="48"/>
+                <w:szCs w:val="48"/>
+              </w:rPr>
+              <w:t>Skulk</w:t>
+            </w:r>
           </w:p>
         </w:tc>
       </w:tr>
@@ -3463,9 +3484,9 @@
         <w:gridCol w:w="738"/>
         <w:gridCol w:w="21"/>
         <w:gridCol w:w="24"/>
-        <w:gridCol w:w="3628"/>
+        <w:gridCol w:w="3627"/>
         <w:gridCol w:w="1112"/>
-        <w:gridCol w:w="3537"/>
+        <w:gridCol w:w="3538"/>
       </w:tblGrid>
       <w:tr>
         <w:tc>
@@ -4715,6 +4736,13 @@
                 <w:szCs w:val="48"/>
               </w:rPr>
             </w:pPr>
+            <w:r>
+              <w:rPr>
+                <w:sz w:val="48"/>
+                <w:szCs w:val="48"/>
+              </w:rPr>
+              <w:t>Eichenstamm</w:t>
+            </w:r>
           </w:p>
         </w:tc>
       </w:tr>
@@ -5167,6 +5195,13 @@
                 <w:szCs w:val="48"/>
               </w:rPr>
             </w:pPr>
+            <w:r>
+              <w:rPr>
+                <w:sz w:val="48"/>
+                <w:szCs w:val="48"/>
+              </w:rPr>
+              <w:t>Festung</w:t>
+            </w:r>
           </w:p>
         </w:tc>
         <w:tc>
@@ -5200,6 +5235,13 @@
                 <w:szCs w:val="48"/>
               </w:rPr>
             </w:pPr>
+            <w:r>
+              <w:rPr>
+                <w:sz w:val="48"/>
+                <w:szCs w:val="48"/>
+              </w:rPr>
+              <w:t>Netherfestung</w:t>
+            </w:r>
           </w:p>
         </w:tc>
       </w:tr>

</xml_diff>